<commit_message>
chore: add obs-demo worker, update reports, register mastra skill
- config.yaml: register obs-demo worker for observability demos
- workers/obs-demo/: new demo worker (node iii-sdk) with config + yaml
- workers/docx-audit/: add iii-sdk ^0.22.0 to Node deps (state reader)
- skills-lock.json: register mastra skill from mastra-ai/skills
- plan/ + workers/reports/: latest audit output (regenerated)

Co-Authored-By: Claude <noreply@anthropic.com>
</commit_message>
<xml_diff>
--- a/plan/副本景嘉微智能文档项目合同-需求和验收标准-0311(1)(1)_audit_report.docx
+++ b/plan/副本景嘉微智能文档项目合同-需求和验收标准-0311(1)(1)_audit_report.docx
@@ -18,7 +18,7 @@
     </w:p>
     <w:p>
       <w:r>
-        <w:t>段落: 90  标题: 55  表格: 0  问题: 106</w:t>
+        <w:t>段落: 90  标题: 55  表格: 0  问题: 110</w:t>
       </w:r>
     </w:p>
     <w:p/>
@@ -2860,7 +2860,7 @@
         <w:t xml:space="preserve">[WARNING] </w:t>
       </w:r>
       <w:r>
-        <w:t>(段落语言质量) [标点] 段落中使用了英文分号“;”，不符合中文标点符号规范。</w:t>
+        <w:t>(段落语言质量) [标点] 段落开头使用了中文不常见的连接号'——'来引导列表项，与整体文档风格不一致。</w:t>
       </w:r>
     </w:p>
     <w:p>
@@ -2870,7 +2870,7 @@
           <w:color w:val="888888"/>
           <w:sz w:val="18"/>
         </w:rPr>
-        <w:t xml:space="preserve">  上下文: 【做什么，程度/效果/反馈】用户可通过关键词、指定知识库、划词等方式发起检索/问答，系统根据用户权限筛选结果，检索响应时间≤1秒，问答响应时间≤3秒，答案需附原文溯源，支持多轮追问，反馈检索结果数量、问答溯源提示，无结果时提示相关推荐。需要提供会话历史记录，保存会话内容、引用，支持继续之前的会话；需要根据附件类型和问答意图，自动路由文本大模型/多模态模型；需要参考 prompt-optimizer</w:t>
+        <w:t xml:space="preserve">  上下文: ——目标知识库存放路径（如品类/子品类/项目/文档）。</w:t>
       </w:r>
     </w:p>
     <w:p>
@@ -2879,7 +2879,7 @@
           <w:color w:val="336699"/>
           <w:sz w:val="20"/>
         </w:rPr>
-        <w:t xml:space="preserve">  建议: “需要提供会话历史记录...；需要根据附件...；需要参考 prompt-optimizer...”中的分号应改为中文分号“；”。</w:t>
+        <w:t xml:space="preserve">  建议: 建议将开头的'——'替换为更符合中文列表规范的格式，例如'·'或直接缩进说明。例如修改为：'目标知识库存放路径（如品类/子品类/项目/文档）。'，或与其他列表项（如第[4]条）保持统一。</w:t>
       </w:r>
     </w:p>
     <w:p>
@@ -2891,7 +2891,7 @@
         <w:t xml:space="preserve">[WARNING] </w:t>
       </w:r>
       <w:r>
-        <w:t>(段落语言质量) [通顺性] “需要参考 prompt-optimizer ，对用户输入的提示词进行优化；”中，外文专有名词“prompt-optimizer”前后直接跟中文逗号和句子，缺乏说明，且“需要”的重复使用使得句式略显冗长。</w:t>
+        <w:t>(段落语言质量) [重复] “入库效率显著提升”与第一段结尾“提升知识资产沉淀效率”在整体文档层面可能含义相近，但在本段内部与“用户无需手动整理和转换格式”结合，表达是集中的。此处单看此段落，“知识入库效率”的表述是清晰的，但“提升”一词的使用可以更具体。严格来说，本段内部无明显重复，但“显著提升”略显口语化且有轻微重复感（“提升”本身已包含积极变化，“显著”增加了主观强调）。建议优化措辞，使其更精确、书面化。</w:t>
       </w:r>
     </w:p>
     <w:p>
@@ -2901,7 +2901,7 @@
           <w:color w:val="888888"/>
           <w:sz w:val="18"/>
         </w:rPr>
-        <w:t xml:space="preserve">  上下文: 【做什么，程度/效果/反馈】用户可通过关键词、指定知识库、划词等方式发起检索/问答，系统根据用户权限筛选结果，检索响应时间≤1秒，问答响应时间≤3秒，答案需附原文溯源，支持多轮追问，反馈检索结果数量、问答溯源提示，无结果时提示相关推荐。需要提供会话历史记录，保存会话内容、引用，支持继续之前的会话；需要根据附件类型和问答意图，自动路由文本大模型/多模态模型；需要参考 prompt-optimizer</w:t>
+        <w:t xml:space="preserve">  上下文: 用户无需手动整理和转换格式，知识入库效率显著提升。</w:t>
       </w:r>
     </w:p>
     <w:p>
@@ -2910,7 +2910,7 @@
           <w:color w:val="336699"/>
           <w:sz w:val="20"/>
         </w:rPr>
-        <w:t xml:space="preserve">  建议: 建议修改句式，例如“并参考如 prompt-optimizer 等工具，对用户输入的提示词进行优化。”</w:t>
+        <w:t xml:space="preserve">  建议: 可将“知识入库效率显著提升”修改为“知识入库效率得以大幅提高”或“有效提升知识入库效率”，使表达更正式、具体。</w:t>
       </w:r>
     </w:p>
     <w:p>
@@ -2922,7 +2922,7 @@
         <w:t xml:space="preserve">[WARNING] </w:t>
       </w:r>
       <w:r>
-        <w:t>(段落语言质量) [通顺性] 句子结构冗长且逻辑并列关系不够清晰，将多个主体（企业管理员、个人用户）的行为和反馈杂糅在一个长句中。</w:t>
+        <w:t>(段落语言质量) [语病] “企业知识库内容快速丰富”是一个缺乏主语的句子片段，与后一句“文档管理员管理负担减轻”并列时，结构上不够完整和平衡。虽然在此类需求列表中可以接受短句，但“快速丰富”作为谓语，缺少明确的实施主体或条件，读起来有些突兀。</w:t>
       </w:r>
     </w:p>
     <w:p>
@@ -2932,7 +2932,7 @@
           <w:color w:val="888888"/>
           <w:sz w:val="18"/>
         </w:rPr>
-        <w:t xml:space="preserve">  上下文: 【做什么，程度/效果/反馈】企业管理员可进行精细化权限配置，敏感信息自动识别并隔离，操作日志可实时查询、导出，权限修改/撤销即时生效；个人用户可设置个人知识库隐私，反馈权限配置成功、敏感信息隔离提示、日志查询结果、隐私设置成功提示，操作响应时间≤1秒，敏感信息识别准确率≥99%。</w:t>
+        <w:t xml:space="preserve">  上下文: 企业知识库内容快速丰富，文档管理员管理负担减轻。</w:t>
       </w:r>
     </w:p>
     <w:p>
@@ -2941,7 +2941,7 @@
           <w:color w:val="336699"/>
           <w:sz w:val="20"/>
         </w:rPr>
-        <w:t xml:space="preserve">  建议: 建议拆分句子。例如：“企业管理员可进行精细化权限配置，敏感信息自动识别并隔离，操作日志可实时查询与导出，权限修改或撤销即时生效。个人用户可设置个人知识库隐私。上述操作均需提供成功反馈、隔离提示、查询结果等，且操作响应时间≤1秒，敏感信息识别准确率≥99%。”</w:t>
+        <w:t xml:space="preserve">  建议: 建议补充主语或调整句式，使其表达更完整。例如修改为：“企业知识库内容得以快速丰富，同时文档管理员的管理负担得以减轻。”或者“此举能快速丰富企业知识库内容，并减轻文档管理员的管理负担。”</w:t>
       </w:r>
     </w:p>
     <w:p>
@@ -2953,7 +2953,7 @@
         <w:t xml:space="preserve">[WARNING] </w:t>
       </w:r>
       <w:r>
-        <w:t>(段落语言质量) [标点] 项目符号“-”后的句子与前面的总起句缺乏明确的语法连接，通常这类列表项后应使用句号。当前格式是“- 性能：...”，这更多见于非正式或演讲提纲。在正式文档中，此类表述可调整。</w:t>
+        <w:t>(段落语言质量) [口语化] “达标时”、“若解析质量不足或误报率高”等表达偏向于口语化或非正式书面语。在正式文档中，可以使用更精确、书面的词汇。</w:t>
       </w:r>
     </w:p>
     <w:p>
@@ -2963,7 +2963,7 @@
           <w:color w:val="888888"/>
           <w:sz w:val="18"/>
         </w:rPr>
-        <w:t xml:space="preserve">  上下文: - 性能：支持单个文件最大1G，单次批量导入文件数量≤1000个，单个长文档解析耗时≤30秒/100页，多文件同时解析不影响系统正常操作。</w:t>
+        <w:t xml:space="preserve">  上下文: 当解析准确率与敏感识别率达标时，用户对自动化工具的信任度增强。反之，若解析质量不足或误报率高，需优化解析算法及敏感词库。</w:t>
       </w:r>
     </w:p>
     <w:p>
@@ -2972,7 +2972,7 @@
           <w:color w:val="336699"/>
           <w:sz w:val="20"/>
         </w:rPr>
-        <w:t xml:space="preserve">  建议: 建议调整格式以更正式。例如，可将“- 性能：”改为独立的标题，如“【性能】”，然后列出具体要求。或者，将冒号后的内容作为列表项完整句子。</w:t>
+        <w:t xml:space="preserve">  建议: 建议将“达标时”改为“达到标准时”或“符合要求时”；将“若解析质量不足或误报率高”改为“若解析质量不佳或误报率较高”。“需优化”可以保留，但整体语境可以更书面。可考虑修改为：“当解析准确率与敏感信息识别率符合要求时，用户对自动化工具的信任度将增强。反之，若解析质量不佳或误报率较高，则需要优化解析算法及敏感词库。”</w:t>
       </w:r>
     </w:p>
     <w:p>
@@ -2984,7 +2984,7 @@
         <w:t xml:space="preserve">[WARNING] </w:t>
       </w:r>
       <w:r>
-        <w:t>(段落语言质量) [语病] “解析过程中无文件损坏、内容丢失”一句，缺少主语，且“无”字与后面的名词短语搭配，虽能理解，但不完全符合“无+负面现象”的典型书面语搭配习惯，可以更精炼。</w:t>
+        <w:t>(段落语言质量) [通顺性] “或结合全网信息获取精准答案”这一分句，其主语承接前面的“个人用户”，但“结合全网信息”的行为描述不够清晰，且与前半句“快速查找个人知识库中的知识”的并列逻辑在动作细节上有些跳跃。同时，后半部分关于企业用户的描述中，“实现高效获取知识、解决疑问”这个目的状语，可以更紧密地与前文连接。</w:t>
       </w:r>
     </w:p>
     <w:p>
@@ -2994,7 +2994,7 @@
           <w:color w:val="888888"/>
           <w:sz w:val="18"/>
         </w:rPr>
-        <w:t xml:space="preserve">  上下文: - 可靠性：导入过程中网络中断，重新连接后可继续导入，不重复导入已完成文件；解析过程中无文件损坏、内容丢失，解析结果与原文一致性≥99%，异常报错时自动保留已导入/解析内容。</w:t>
+        <w:t xml:space="preserve">  上下文: 【应用场景】个人用户需快速查找个人知识库中的知识，或结合全网信息获取精准答案；企业用户需查找企业内部知识，且只能查看自身权限范围内的内容，实现高效获取知识、解决疑问。</w:t>
       </w:r>
     </w:p>
     <w:p>
@@ -3003,7 +3003,7 @@
           <w:color w:val="336699"/>
           <w:sz w:val="20"/>
         </w:rPr>
-        <w:t xml:space="preserve">  建议: 可修改为“在解析过程中确保文件无损坏、内容无丢失”，或“解析过程不会导致文件损坏或内容丢失”。</w:t>
+        <w:t xml:space="preserve">  建议: 可调整语序和用词，使逻辑更顺畅。例如：“个人用户可快速查找个人知识库，或借助全网信息获取精准答案；企业用户则需查找内部知识，且仅能查看权限范围内的内容，从而高效获取知识、解决疑问。”</w:t>
       </w:r>
     </w:p>
     <w:p>
@@ -3015,7 +3015,7 @@
         <w:t xml:space="preserve">[WARNING] </w:t>
       </w:r>
       <w:r>
-        <w:t>(段落语言质量) [口语化] “支持导入/解析失败排查指引”中，“排查指引”一词略显口语化，不够书面和正式。</w:t>
+        <w:t>(段落语言质量) [通顺性] “指定知识库（所停留界面、或所选择文档夹、或所打开文档下、跨文件夹或文件）”这部分括号内的解释列举了多种情况，但“所停留界面、或所选择文档夹、或所打开文档下”这几项之间的并列关系使用“、”和“或”混合，标点使用不规范，且“所打开文档下”的表述（“文档下”可能意指文档内部或所属位置）容易产生歧义。整个括号内内容读起来比较绕口，不够清晰。</w:t>
       </w:r>
     </w:p>
     <w:p>
@@ -3025,7 +3025,7 @@
           <w:color w:val="888888"/>
           <w:sz w:val="18"/>
         </w:rPr>
-        <w:t xml:space="preserve">  上下文: - 可服务性：支持导入/解析失败排查指引，提供常见问题解决方案（如格式转换工具推荐），支持批量导入日志导出，便于核对导入内容。</w:t>
+        <w:t xml:space="preserve">  上下文: 【输入】检索关键词、指定知识库（所停留界面、或所选择文档夹、或所打开文档下、跨文件夹或文件）、问答问题（输入文字/划词触发）、检索范围选择（个人终端/本系统）、追问指令。</w:t>
       </w:r>
     </w:p>
     <w:p>
@@ -3034,7 +3034,7 @@
           <w:color w:val="336699"/>
           <w:sz w:val="20"/>
         </w:rPr>
-        <w:t xml:space="preserve">  建议: 建议改为“支持对导入或解析失败的情况提供排查指南”或“提供导入/解析失败的故障排查指南”。</w:t>
+        <w:t xml:space="preserve">  建议: 建议规范并列关系的标点，并澄清可能歧义的表述。例如修改为：“指定知识库（可为当前停留的界面、选定的文件夹、正打开的文档所在位置，或进行跨文件夹/文件检索）。”这样逻辑层次更清楚。</w:t>
       </w:r>
     </w:p>
     <w:p>
@@ -3046,7 +3046,7 @@
         <w:t xml:space="preserve">[WARNING] </w:t>
       </w:r>
       <w:r>
-        <w:t>(段落语言质量) [通顺性] 此句“文件数据迁移无遗漏，覆盖率100%”非常简短，但放在文档中作为一项独立要求出现，与前几条详细列出的特性（如性能、可靠性）在表述详尽程度上不匹配，显得孤立且缺乏上下文。它更像是一个目标或结果断言，而非对功能的描述。</w:t>
+        <w:t>(段落语言质量) [通顺性] “检索/问答过程中系统不崩溃”与“权限筛选无遗漏”语义衔接略微松散。后句括号内的解释使句式稍显冗长。</w:t>
       </w:r>
     </w:p>
     <w:p>
@@ -3056,7 +3056,7 @@
           <w:color w:val="888888"/>
           <w:sz w:val="18"/>
         </w:rPr>
-        <w:t xml:space="preserve">  上下文: - 文件数据迁移无遗漏，覆盖率100%。</w:t>
+        <w:t xml:space="preserve">  上下文: - 可靠性：检索/问答过程中系统不崩溃，权限筛选无遗漏（未授权内容不展示），溯源链接准确可跳转，多轮追问可连续响应，无答非所问、内容错误情况。</w:t>
       </w:r>
     </w:p>
     <w:p>
@@ -3065,7 +3065,7 @@
           <w:color w:val="336699"/>
           <w:sz w:val="20"/>
         </w:rPr>
-        <w:t xml:space="preserve">  建议: 建议根据上下文明确其所指。例如，若仍是“可服务性”的一部分，可并入前项。或明确其项类别，如“【完整性】文件数据迁移应确保无遗漏，覆盖率达到100%。”</w:t>
+        <w:t xml:space="preserve">  建议: “可靠性：系统在检索/问答过程中运行稳定不崩溃；权限筛选严密，避免对未授权内容的不当展示；溯源链接准确且可跳转；支持多轮追问的连续响应，且无答非所问或内容错误的情况。”</w:t>
       </w:r>
     </w:p>
     <w:p>
@@ -3077,7 +3077,7 @@
         <w:t xml:space="preserve">[WARNING] </w:t>
       </w:r>
       <w:r>
-        <w:t>(段落语言质量) [标点] “支持多用户同时检索/问答（≥1000人在线，≥50人并发问答）”中，括号内使用“≥”符号，在中文中应使用“≥”或“大于等于”文字表达。虽然技术文档中常见这类符号，但严格遵循中文书写规范时，应优先使用中文表达或全角符号。</w:t>
+        <w:t>(段落语言质量) [通顺性] “提供检索技巧指南”与前文语义连续性可优化，“系统异常时自动提示并恢复服务”表述略显口语化。</w:t>
       </w:r>
     </w:p>
     <w:p>
@@ -3087,7 +3087,7 @@
           <w:color w:val="888888"/>
           <w:sz w:val="18"/>
         </w:rPr>
-        <w:t xml:space="preserve">  上下文: - 性能：单用户单次检索响应时间≤1秒，问答响应时间≤3秒，支持多用户同时检索/问答（≥1000人在线，≥50人并发问答），检索结果相关性≥95%，问答准确率≥98%（企业级场景）。</w:t>
+        <w:t xml:space="preserve">  上下文: - 可服务性：支持检索/问答结果反馈（如结果不精准可提交反馈），提供检索技巧指南，权限不足时提示申请授权入口，系统异常时自动提示并恢复服务。</w:t>
       </w:r>
     </w:p>
     <w:p>
@@ -3096,7 +3096,7 @@
           <w:color w:val="336699"/>
           <w:sz w:val="20"/>
         </w:rPr>
-        <w:t xml:space="preserve">  建议: 建议统一为“（大于等于1000人在线，大于等于50人并发问答）”，或在允许的情况下说明使用数学符号是规范的一部分。</w:t>
+        <w:t xml:space="preserve">  建议: “可服务性：支持对检索/问答结果进行反馈（当结果不精准时可提交反馈）；提供相关检索操作指南；在权限不足时，系统提示授权申请入口；当系统异常时，能自动提示并尝试恢复服务。”</w:t>
       </w:r>
     </w:p>
     <w:p>
@@ -3108,7 +3108,7 @@
         <w:t xml:space="preserve">[WARNING] </w:t>
       </w:r>
       <w:r>
-        <w:t>(段落语言质量) [标点] 性能指标描述时，使用了括号，但括号内又使用了分号分隔，语义有交叉，导致阅读稍显混乱。</w:t>
+        <w:t>(段落语言质量) [语病] “支持同时配置多个部门/用户权限（≥100个）”中“≥100个”的修饰对象不明确，是“部门/用户”的数量还是“权限”的数量？</w:t>
       </w:r>
     </w:p>
     <w:p>
@@ -3127,7 +3127,7 @@
           <w:color w:val="336699"/>
           <w:sz w:val="20"/>
         </w:rPr>
-        <w:t xml:space="preserve">  建议: 建议将括号内的分号改为逗号，并优化句式结构使其更清晰。例如：'权限配置/修改/撤销、敏感信息识别、操作日志查询/导出的响应时间分别要求≤1秒、≤3秒和≤3秒；同时支持同时配置≥100个部门/用户的权限。'</w:t>
+        <w:t xml:space="preserve">  建议: “性能：权限的配置、修改、撤销操作响应时间不超过1秒；敏感信息识别响应时间不超过3秒；操作日志的查询与导出响应时间不超过3秒；支持同时为多个部门或用户（数量不低于100）配置权限。”</w:t>
       </w:r>
     </w:p>
     <w:p>
@@ -3139,7 +3139,7 @@
         <w:t xml:space="preserve">[WARNING] </w:t>
       </w:r>
       <w:r>
-        <w:t>(段落语言质量) [通顺性] 句子结构稍显拗口，特别是'即可'的位置和'自动索引和检索'的搭配可以优化，使其更符合中文表达习惯。</w:t>
+        <w:t>(段落语言质量) [通顺性] “支持权限配置错误排查，提供权限等级说明文档”句式不平行，通顺性有待提升。</w:t>
       </w:r>
     </w:p>
     <w:p>
@@ -3149,7 +3149,7 @@
           <w:color w:val="888888"/>
           <w:sz w:val="18"/>
         </w:rPr>
-        <w:t xml:space="preserve">  上下文: - 经用户授权后，不导入个人终端设备上的文档即可自动索引和检索个人知识。</w:t>
+        <w:t xml:space="preserve">  上下文: - 可服务性：支持权限配置错误排查，提供权限等级说明文档，敏感信息误判时可手动解除隔离，操作日志导出支持多种格式，支持在线咨询权限相关问题。</w:t>
       </w:r>
     </w:p>
     <w:p>
@@ -3158,7 +3158,7 @@
           <w:color w:val="336699"/>
           <w:sz w:val="20"/>
         </w:rPr>
-        <w:t xml:space="preserve">  建议: 建议修改为：'经用户授权后，无需导入个人终端设备上的文档，即可实现对个人知识的自动索引与检索。' 或更简洁的'经用户授权后，可不导入个人终端设备上的文档，自动完成对其个人知识的索引和检索。'</w:t>
+        <w:t xml:space="preserve">  建议: “可服务性：提供权限配置错误的排查支持与权限等级说明文档；当敏感信息被误判时，支持手动解除隔离；操作日志导出支持多种格式；同时支持权限相关问题的在线咨询。”</w:t>
       </w:r>
     </w:p>
     <w:p>
@@ -3170,7 +3170,7 @@
         <w:t xml:space="preserve">[WARNING] </w:t>
       </w:r>
       <w:r>
-        <w:t>(段落语言质量) [通顺性] 段落较长且为长句罗列，部分句子结构可以优化，例如'在生成后可支持用户预览...'中的'在'字稍显冗余，整体流畅度可进一步提升。</w:t>
+        <w:t>(段落语言质量) [语病] 双重否定“不导入...即可...”和长定语“个人终端设备上的”使句子略显拗口。核心意思是无需导入即可索引检索。</w:t>
       </w:r>
     </w:p>
     <w:p>
@@ -3180,7 +3180,7 @@
           <w:color w:val="888888"/>
           <w:sz w:val="18"/>
         </w:rPr>
-        <w:t xml:space="preserve">  上下文: 【做什么，程度/效果/反馈】：大模型依据输入信息及私有化环境配置，自动生成符合模板框架、格式规范的docx文档内容；支持在用户已打开的office word与wps文档光标停留位置生成，也可在生成后可支持用户预览、下载为WORD；生成过程实时可视化，用户可全程浏览进度及内容，也可以随时暂停生成；生成后由用户最终判定是否放弃或接受；生成内容严格适配给定模板的格式规范，每个内容片段如涉及到生成依据时应</w:t>
+        <w:t xml:space="preserve">  上下文: - 经用户授权后，不导入个人终端设备上的文档即可自动索引和检索个人知识。</w:t>
       </w:r>
     </w:p>
     <w:p>
@@ -3189,7 +3189,7 @@
           <w:color w:val="336699"/>
           <w:sz w:val="20"/>
         </w:rPr>
-        <w:t xml:space="preserve">  建议: 建议拆分长句并优化连接。例如：'大模型依据输入信息及私有化环境配置，自动生成符合模板框架和格式规范的docx文档内容。支持在用户已打开的Office Word或WPS文档光标停留位置直接生成，也支持生成后供用户预览或下载为WORD文件。生成过程实时可视，用户可全程浏览进度与内容，并可随时暂停。最终由用户决定接受或放弃生成结果。生成内容严格遵循给定模板的格式规范，涉及生成依据的内容片段需以批注形式标注溯源信息（对应至参考文档的具体来源），确保内容可追溯。'</w:t>
+        <w:t xml:space="preserve">  建议: “在获得用户授权后，系统无需导入个人终端设备上的文档即可自动对其知识进行索引和检索。”</w:t>
       </w:r>
     </w:p>
     <w:p>
@@ -3201,7 +3201,7 @@
         <w:t xml:space="preserve">[WARNING] </w:t>
       </w:r>
       <w:r>
-        <w:t>(段落语言质量) [口语化] 使用了'文文一致性'这一口语化或自造的表达，不够正式和通顺。</w:t>
+        <w:t>(段落语言质量) [通顺性] 长句过多，主语从“应用场景”跳转到“用户”，再到“涵盖...场景”，句子结构较复杂，可读性受影响。</w:t>
       </w:r>
     </w:p>
     <w:p>
@@ -3211,7 +3211,7 @@
           <w:color w:val="888888"/>
           <w:sz w:val="18"/>
         </w:rPr>
-        <w:t xml:space="preserve">  上下文: 【外界反应】：生成过程中若出现软件切换、页面卡顿等情况，恢复正常办公界面后，用户可选择继续生成、暂停生成或终止生成；生成内容经用户确认接受后，可直接在office word与wps文档中插入也可以支持预览、下载为word，溯源批注便于用户核对内容匹配度，提升文档编制效率及文文一致性。</w:t>
+        <w:t xml:space="preserve">  上下文: 【应用场景】：适用于私有化部署大模型的办公场景，用户需基于指定模板和参考知识，快速生成符合格式规范的docx文档，涵盖日常办公文书、专业报告、业务文档等各类需严格遵循模板格式的文档创作场景。</w:t>
       </w:r>
     </w:p>
     <w:p>
@@ -3220,7 +3220,7 @@
           <w:color w:val="336699"/>
           <w:sz w:val="20"/>
         </w:rPr>
-        <w:t xml:space="preserve">  建议: 建议将'文文一致性'修改为更正式、清晰的表达，如'文档内容的一致性'、'文档前后一致性'或'文档内部一致性'。</w:t>
+        <w:t xml:space="preserve">  建议: “【应用场景】：本功能适用于私有化部署大模型的办公场景。用户可基于指定的模板和参考知识，快速生成符合格式规范的docx文档。它涵盖了日常办公文书、专业报告、业务文档等多种需要严格遵循模板格式的文档创作需求。”</w:t>
       </w:r>
     </w:p>
     <w:p>
@@ -3232,7 +3232,7 @@
         <w:t xml:space="preserve">[WARNING] </w:t>
       </w:r>
       <w:r>
-        <w:t>(段落语言质量) [口语化] 段落开头使用了'必须'一词，这是一个典型的口语化命令式表达，不符合正式技术文档的客观陈述风格。</w:t>
+        <w:t>(段落语言质量) [通顺性] 句子冗长，主语“职场人员”后跟了很长的定语和描述，阅读起来不够流畅。</w:t>
       </w:r>
     </w:p>
     <w:p>
@@ -3242,7 +3242,7 @@
           <w:color w:val="888888"/>
           <w:sz w:val="18"/>
         </w:rPr>
-        <w:t xml:space="preserve">  上下文: - 必须兼容国内主流开源大模型（如QWEN3-32b、Deepseek32b），模型适配成功率100%。</w:t>
+        <w:t xml:space="preserve">  上下文: 【利益相关者/执行人员】：使用私有化大模型办公的职场人员（如行政、文案、运营、技术文档撰写者等），需依托模板和参考资料高效完成文档创作，对文档格式规范性、内容准确性有明确要求的用户。</w:t>
       </w:r>
     </w:p>
     <w:p>
@@ -3251,7 +3251,7 @@
           <w:color w:val="336699"/>
           <w:sz w:val="20"/>
         </w:rPr>
-        <w:t xml:space="preserve">  建议: 将'必须兼容'修改为'应兼容'、'需兼容'或'兼容'。</w:t>
+        <w:t xml:space="preserve">  建议: “【利益相关者/执行人员】：使用私有化大模型办公的职场人员（如行政、文案、运营、技术文档撰写者等）。这类用户需要依托模板和参考资料高效完成文档创作，并对文档的格式规范性与内容准确性有明确要求。”</w:t>
       </w:r>
     </w:p>
     <w:p>
@@ -3263,7 +3263,7 @@
         <w:t xml:space="preserve">[WARNING] </w:t>
       </w:r>
       <w:r>
-        <w:t>(段落语言质量) [重复] 段落中'需支持高可用部署'这一核心概念，在'数据库高可用部署'和'模块服务需支持高可用部署'中出现了重复表述，结构略显啰嗦。</w:t>
+        <w:t>(段落语言质量) [标点] 使用破折号 “——” 来区分“必填”和“非必填”项，且段落较长，但破折号在中文中用于解释说明或语义转折，此处用分号“；”或另起项目符号列表更清晰。</w:t>
       </w:r>
     </w:p>
     <w:p>
@@ -3273,7 +3273,7 @@
           <w:color w:val="888888"/>
           <w:sz w:val="18"/>
         </w:rPr>
-        <w:t xml:space="preserve">  上下文: 乙方开发的所有模块，需支持数据库高可用部署，采用主从架构，确保主库故障时，从库可快速切换，不影响模块正常运行；模块服务需支持高可用部署，实现无状态服务设计，确保单个服务节点故障时，其他节点可无缝接管，不中断业务；模块中涉及缓存的功能，需采用分布式缓存技术实现（Redis），确保缓存高可用，避免缓存单点故障导致的业务异常；模块中涉及定时任务的功能，需采用分布式调度技术实现（XXL-Job），确保定时</w:t>
+        <w:t xml:space="preserve">  上下文: 【条件】：已部署私有化大模型环境，用户已安装office word与wps办公软件；需提前准备好文档主题、框架参考文档（模板）、内容参考文档（选择知识库/上传文档）——前述为必填，补充信息、使用场景描述、文档篇幅要求、风格要求、模型选配及参数调整要求——后述为非必填。</w:t>
       </w:r>
     </w:p>
     <w:p>
@@ -3282,7 +3282,7 @@
           <w:color w:val="336699"/>
           <w:sz w:val="20"/>
         </w:rPr>
-        <w:t xml:space="preserve">  建议: 可考虑调整结构以消除冗余，例如：'乙方开发的所有模块，其数据库与服务均需支持高可用部署。数据库采用主从架构...；服务采用无状态设计...'。</w:t>
+        <w:t xml:space="preserve">  建议: “【条件】：已部署私有化大模型环境，且用户已安装Office Word或WPS办公软件。需提前准备以下信息：必须提供：文档主题、框架参考文档（模板）、内容参考文档（选择知识库或上传文档）。可选提供：补充信息、使用场景描述、文档篇幅要求、风格要求、模型选配及参数调整要求。”</w:t>
       </w:r>
     </w:p>
     <w:p>
@@ -3294,7 +3294,7 @@
         <w:t xml:space="preserve">[WARNING] </w:t>
       </w:r>
       <w:r>
-        <w:t>(段落语言质量) [重复] '需确保数据不丢失'与后面'数据库需配置定时备份机制，支持定时备份，备份数据可正常恢复'在语义上有重叠，后者是前者的具体实现方式之一，直接列举要求更为简洁。</w:t>
+        <w:t>(段落语言质量) [通顺性] 输入项以长列表形式呈现，缺乏逻辑连接词，略显堆砌。括号内的解释使句子结构复杂。</w:t>
       </w:r>
     </w:p>
     <w:p>
@@ -3304,7 +3304,7 @@
           <w:color w:val="888888"/>
           <w:sz w:val="18"/>
         </w:rPr>
-        <w:t xml:space="preserve">  上下文: 乙方开发模块需确保数据不丢失，数据库需配置定时备份机制，支持定时备份，备份数据可正常恢复，备份过程不影响模块正常运行；模块需具备故障自动恢复能力，针对常见故障（如服务重启、网络波动、缓存失效），可在故障解除后自动恢复正常，无需人工干预；核心接口需具备重试机制，避免因网络瞬时波动导致的请求失败，重试策略可配置（重试次数、重试间隔）。</w:t>
+        <w:t xml:space="preserve">  上下文: 【输入】：用户提供的文档主题、框架参考文档、内容参考文档（指定知识库/上传文档，上传文档支持常见格式，如：doc、docx、txt、pdf、xlsx、ppt、图片）、其他补充信息（个性化要求）、使用场景描述、文档篇幅、风格、模型配置参数（模型选择、参数调整结果）设定。</w:t>
       </w:r>
     </w:p>
     <w:p>
@@ -3313,7 +3313,131 @@
           <w:color w:val="336699"/>
           <w:sz w:val="20"/>
         </w:rPr>
-        <w:t xml:space="preserve">  建议: 删除'需确保数据不丢失，'，直接以'数据库需配置定时备份机制...'开头，或修改为'为保障数据不丢失，数据库需...'。</w:t>
+        <w:t xml:space="preserve">  建议: “【输入】：由用户提供以下信息：文档主题、框架参考文档（模板）、内容参考文档（可从指定知识库选择或上传文档，支持doc、docx、txt、pdf、xlsx、ppt、图片等常见格式）、其他补充信息（个性化要求）、使用场景描述、文档篇幅、风格偏好以及模型配置参数（如模型选择和参数调整结果）。”</w:t>
+      </w:r>
+    </w:p>
+    <w:p>
+      <w:r>
+        <w:rPr>
+          <w:b/>
+          <w:color w:val="CC8800"/>
+        </w:rPr>
+        <w:t xml:space="preserve">[WARNING] </w:t>
+      </w:r>
+      <w:r>
+        <w:t>(段落语言质量) [通顺性] 段落内容极为丰富，包含多个并列动作和说明，全部放在一个句子或紧密连接的句中，导致句子过长，信息密度过高，不易阅读。</w:t>
+      </w:r>
+    </w:p>
+    <w:p>
+      <w:r>
+        <w:rPr>
+          <w:i/>
+          <w:color w:val="888888"/>
+          <w:sz w:val="18"/>
+        </w:rPr>
+        <w:t xml:space="preserve">  上下文: 【做什么，程度/效果/反馈】：大模型依据输入信息及私有化环境配置，自动生成符合模板框架、格式规范的docx文档内容；支持在用户已打开的office word与wps文档光标停留位置生成，也可在生成后可支持用户预览、下载为WORD；生成过程实时可视化，用户可全程浏览进度及内容，也可以随时暂停生成；生成后由用户最终判定是否放弃或接受；生成内容严格适配给定模板的格式规范，每个内容片段如涉及到生成依据时应</w:t>
+      </w:r>
+    </w:p>
+    <w:p>
+      <w:r>
+        <w:rPr>
+          <w:color w:val="336699"/>
+          <w:sz w:val="20"/>
+        </w:rPr>
+        <w:t xml:space="preserve">  建议: “【做什么，程度/效果/反馈】：大模型基于输入信息及私有化环境配置，自动生成符合模板框架和格式规范的docx文档内容。支持在用户已打开的Office Word或WPS文档光标处生成，也支持生成后的预览与下载。生成过程对用户实时可视化，可全程浏览进度及内容，并可随时暂停。最终由用户决定接受或放弃生成结果。生成内容严格适配给定模板，内容片段若涉及生成依据，会以批注形式标注溯源信息，对应到参考文档的具体来源，确保内容可追溯。”</w:t>
+      </w:r>
+    </w:p>
+    <w:p>
+      <w:r>
+        <w:rPr>
+          <w:b/>
+          <w:color w:val="CC8800"/>
+        </w:rPr>
+        <w:t xml:space="preserve">[WARNING] </w:t>
+      </w:r>
+      <w:r>
+        <w:t>(段落语言质量) [通顺性] “文档生成位置可按需选择（现有文档光标处/新建空白文档）”与前段[11]重复，且句子并列关系处理可优化。</w:t>
+      </w:r>
+    </w:p>
+    <w:p>
+      <w:r>
+        <w:rPr>
+          <w:i/>
+          <w:color w:val="888888"/>
+          <w:sz w:val="18"/>
+        </w:rPr>
+        <w:t xml:space="preserve">  上下文: 【输出】：符合模板格式规范、内容贴合参考资料及用户需求的docx文档，内容片段附带溯源批注；文档生成位置可按需选择（现有文档光标处/新建空白文档），生成结果可由用户确认放弃或接受。</w:t>
+      </w:r>
+    </w:p>
+    <w:p>
+      <w:r>
+        <w:rPr>
+          <w:color w:val="336699"/>
+          <w:sz w:val="20"/>
+        </w:rPr>
+        <w:t xml:space="preserve">  建议: “【输出】：生成符合模板格式规范、内容贴合参考资料及用户需求的docx文档，内容片段附有溯源批注。文档生成位置可选（现有文档光标处或新建空白文档），生成结果最终由用户确认接受或放弃。”</w:t>
+      </w:r>
+    </w:p>
+    <w:p>
+      <w:r>
+        <w:rPr>
+          <w:b/>
+          <w:color w:val="CC8800"/>
+        </w:rPr>
+        <w:t xml:space="preserve">[WARNING] </w:t>
+      </w:r>
+      <w:r>
+        <w:t>(段落语言质量) [通顺性] 句子前半部分处理异常情况，后半部分说明正常操作，转折不够清晰。“文文一致性”为不常见的简称。</w:t>
+      </w:r>
+    </w:p>
+    <w:p>
+      <w:r>
+        <w:rPr>
+          <w:i/>
+          <w:color w:val="888888"/>
+          <w:sz w:val="18"/>
+        </w:rPr>
+        <w:t xml:space="preserve">  上下文: 【外界反应】：生成过程中若出现软件切换、页面卡顿等情况，恢复正常办公界面后，用户可选择继续生成、暂停生成或终止生成；生成内容经用户确认接受后，可直接在office word与wps文档中插入也可以支持预览、下载为word，溯源批注便于用户核对内容匹配度，提升文档编制效率及文文一致性。</w:t>
+      </w:r>
+    </w:p>
+    <w:p>
+      <w:r>
+        <w:rPr>
+          <w:color w:val="336699"/>
+          <w:sz w:val="20"/>
+        </w:rPr>
+        <w:t xml:space="preserve">  建议: “【外界反应】：生成过程中如遇软件切换或页面卡顿，在办公界面恢复后，用户可选择继续、暂停或终止生成。用户确认接受生成内容后，可直接将其插入Office Word或WPS文档，也可预览或下载为Word文件。溯源批注便于用户核对内容匹配度，从而提升文档编制效率和整体一致性。”</w:t>
+      </w:r>
+    </w:p>
+    <w:p>
+      <w:r>
+        <w:rPr>
+          <w:b/>
+          <w:color w:val="CC8800"/>
+        </w:rPr>
+        <w:t xml:space="preserve">[WARNING] </w:t>
+      </w:r>
+      <w:r>
+        <w:t>(段落语言质量) [标点] 第一句结尾使用分号“；”不当，其后内容是对“日志需规范、详细，可追溯”的解释或详述，建议改用冒号“：”以引出具体说明。此外，整段最后一项要求后的分号可改为句号。</w:t>
+      </w:r>
+    </w:p>
+    <w:p>
+      <w:r>
+        <w:rPr>
+          <w:i/>
+          <w:color w:val="888888"/>
+          <w:sz w:val="18"/>
+        </w:rPr>
+        <w:t xml:space="preserve">  上下文: 乙方开发模块需完善日志体系，包含操作日志、系统日志、错误日志三大类，日志需规范、详细，可追溯；操作日志需记录所有对模块的操作；系统日志需记录模块运行状态（服务启动/停止、接口调用情况、资源占用情况）；错误日志需记录模块运行过程中的所有异常（错误代码、错误信息、异常堆栈、发生时间、触发条件），错误信息清晰，便于排查问题；模块需提供清晰的部署文档、配置文档、接口文档，便于我方后续维护、排查问题。</w:t>
+      </w:r>
+    </w:p>
+    <w:p>
+      <w:r>
+        <w:rPr>
+          <w:color w:val="336699"/>
+          <w:sz w:val="20"/>
+        </w:rPr>
+        <w:t xml:space="preserve">  建议: 将“日志需规范、详细，可追溯；”中的分号改为冒号。例如：“乙方开发模块需完善日志体系，包含操作日志、系统日志、错误日志三大类，日志需规范、详细，可追溯：”。同时，可将段末“便于我方后续维护、排查问题。”前的分号改为句号。</w:t>
       </w:r>
     </w:p>
     <w:p/>
@@ -3327,7 +3451,7 @@
     </w:p>
     <w:p>
       <w:r>
-        <w:t>发现 91 个错误、15 个警告。请优先处理 ERROR 级别条目。</w:t>
+        <w:t>发现 91 个错误、19 个警告。请优先处理 ERROR 级别条目。</w:t>
       </w:r>
     </w:p>
     <w:sectPr>

</xml_diff>